<commit_message>
spider test stage 2
</commit_message>
<xml_diff>
--- a/Dilina/NL TO SQL prototype/Stage_2_Task1_Report.docx
+++ b/Dilina/NL TO SQL prototype/Stage_2_Task1_Report.docx
@@ -278,7 +278,7 @@
               <w:t xml:space="preserve">Key Milestone Outcome: </w:t>
             </w:r>
             <w:r>
-              <w:t>By replacing full DDL schema dumping with our new Minimal-Context Schema Extractor (schema_extractor.py), NL-to-SQL execution accuracy jumped from 77.00% to 81.00% on standard N=100 evaluation and achieved 71.71% across 251 multi-domain Spider queries. Prompt token size dropped by 57.4%, and Schema Linking Errors were reduced to just 1.1%.</w:t>
+              <w:t>By replacing full DDL schema dumping with our new Minimal-Context Schema Extractor (schema_extractor.py), the engine successfully evaluated all 1,034 Spider benchmark queries using Cerebras Cloud 31B (gemma-4-31b). Across the entire 1,034 dataset, Execution Accuracy reached 65.18% (674 out of 1,034 correct queries), Prompt Token size dropped by 66.4% (from ~650 down to 218.7 tokens), and Schema Linking Errors were suppressed to under 0.6%.</w:t>
             </w:r>
           </w:p>
         </w:tc>
@@ -373,7 +373,7 @@
     </w:p>
     <w:p>
       <w:r>
-        <w:t>A rigorous evaluation was conducted across Spider benchmark queries using Groq Llama 3.3 70B. The results demonstrate substantial improvements across accuracy, efficiency, and error reduction:</w:t>
+        <w:t>A comprehensive evaluation was conducted across all 1,034 Spider benchmark queries using Cerebras Cloud (gemma-4-31b). The empirical benchmark results demonstrate major improvements in accuracy, token efficiency, and error suppression:</w:t>
       </w:r>
     </w:p>
     <w:tbl>
@@ -469,7 +469,7 @@
                 <w:b/>
                 <w:color w:val="FFFFFF"/>
               </w:rPr>
-              <w:t>Stage 2 Extended (N=251 Benchmark)</w:t>
+              <w:t>Stage 2 Complete (N=1,034 Dataset)</w:t>
             </w:r>
           </w:p>
         </w:tc>
@@ -505,7 +505,7 @@
           </w:tcPr>
           <w:p>
             <w:r>
-              <w:t>77.00%</w:t>
+              <w:t>77.00% (70B)</w:t>
             </w:r>
           </w:p>
         </w:tc>
@@ -526,7 +526,7 @@
                 <w:b/>
                 <w:color w:val="0E7490"/>
               </w:rPr>
-              <w:t>81.00%</w:t>
+              <w:t>81.00% (70B)</w:t>
             </w:r>
           </w:p>
         </w:tc>
@@ -547,7 +547,7 @@
                 <w:b/>
                 <w:color w:val="0E7490"/>
               </w:rPr>
-              <w:t>71.71%</w:t>
+              <w:t>65.18% (674/1,034)</w:t>
             </w:r>
           </w:p>
         </w:tc>
@@ -625,7 +625,7 @@
                 <w:b/>
                 <w:color w:val="0E7490"/>
               </w:rPr>
-              <w:t>276.8 tokens</w:t>
+              <w:t>218.7 tokens (-66.4%)</w:t>
             </w:r>
           </w:p>
         </w:tc>
@@ -703,7 +703,7 @@
                 <w:b/>
                 <w:color w:val="0E7490"/>
               </w:rPr>
-              <w:t>3 errors (1.1%)</w:t>
+              <w:t>4 errors (0.4%)</w:t>
             </w:r>
           </w:p>
         </w:tc>
@@ -781,7 +781,7 @@
                 <w:b/>
                 <w:color w:val="0E7490"/>
               </w:rPr>
-              <w:t>3 errors (1.1%)</w:t>
+              <w:t>6 errors (0.6%)</w:t>
             </w:r>
           </w:p>
         </w:tc>
@@ -859,7 +859,7 @@
                 <w:b/>
                 <w:color w:val="0E7490"/>
               </w:rPr>
-              <w:t>10 errors (4.0%)</w:t>
+              <w:t>172 errors (16.6%)</w:t>
             </w:r>
           </w:p>
         </w:tc>

</xml_diff>